<commit_message>
auto: session 2026-07-11 10:49
Co-Authored-By: Claude Opus 4.8 (1M context) <noreply@anthropic.com>
</commit_message>
<xml_diff>
--- a/bai-pr/2026/07/03-baotuyenquang-giai-phap-mot-cua.docx
+++ b/bai-pr/2026/07/03-baotuyenquang-giai-phap-mot-cua.docx
@@ -7,7 +7,7 @@
         <w:pStyle w:val="Heading1"/>
       </w:pPr>
       <w:r>
-        <w:t xml:space="preserve">DigicomVN mang đến giải pháp đồng bộ: website và automation truyền thông ứng dụng AI</w:t>
+        <w:t xml:space="preserve">DigicomVN mang đến giải pháp truyền thông đồng bộ: booking báo chí và automation ứng dụng AI</w:t>
       </w:r>
     </w:p>
     <w:p>
@@ -20,7 +20,7 @@
           <w:b/>
           <w:bCs/>
         </w:rPr>
-        <w:t xml:space="preserve">Với nhiều doanh nghiệp nhỏ và vừa, việc tự vận hành website và đăng bài truyền thông thủ công mỗi ngày đang trở thành gánh nặng nhân sự. Digicom mang đến giải pháp một cửa: website và automation truyền thông ứng dụng AI, đã được ICD Việt Nam áp dụng và ghi nhận hiệu quả rõ rệt.</w:t>
+        <w:t xml:space="preserve">Với nhiều doanh nghiệp nhỏ và vừa, việc tự liên hệ báo chí và theo dõi hiệu quả truyền thông thủ công đang trở thành gánh nặng nhân sự. DigicomVN mang đến dịch vụ booking báo chí kết hợp automation ứng dụng AI, đã được ICD Việt Nam áp dụng và ghi nhận hiệu quả rõ rệt.</w:t>
       </w:r>
     </w:p>
     <w:p>
@@ -33,7 +33,7 @@
           <wp:inline distT="0" distB="0" distL="0" distR="0">
             <wp:extent cx="4572000" cy="3048000"/>
             <wp:effectExtent t="0" r="0" b="0" l="0"/>
-            <wp:docPr id="1" name="Anh minh hoa" descr="Ảnh minh họa: Vận hành website ổn định là nền tảng cho mọi hoạt động truyền thông automation." title="Anh minh hoa"/>
+            <wp:docPr id="1" name="Anh minh hoa" descr="Ảnh minh họa: Thành phố Tuyên Quang, nơi nhiều doanh nghiệp nhỏ và vừa đang tìm cách xây dựng hiện diện thương hiệu." title="Anh minh hoa"/>
             <wp:cNvGraphicFramePr>
               <a:graphicFrameLocks xmlns:a="http://schemas.openxmlformats.org/drawingml/2006/main" noChangeAspect="1"/>
             </wp:cNvGraphicFramePr>
@@ -81,7 +81,7 @@
           <w:sz w:val="20"/>
           <w:szCs w:val="20"/>
         </w:rPr>
-        <w:t xml:space="preserve">Ảnh minh họa: Vận hành website ổn định là nền tảng cho mọi hoạt động truyền thông automation.</w:t>
+        <w:t xml:space="preserve">Ảnh minh họa: Thành phố Tuyên Quang, nơi nhiều doanh nghiệp nhỏ và vừa đang tìm cách xây dựng hiện diện thương hiệu.</w:t>
       </w:r>
     </w:p>
     <w:p>
@@ -89,46 +89,33 @@
         <w:pStyle w:val="Heading2"/>
       </w:pPr>
       <w:r>
-        <w:t xml:space="preserve">Gánh nặng vận hành thủ công</w:t>
-      </w:r>
-    </w:p>
-    <w:p>
-      <w:pPr>
-        <w:spacing w:after="200"/>
-        <w:jc w:val="both"/>
-      </w:pPr>
-      <w:r>
-        <w:rPr>
-          <w:b w:val="false"/>
-          <w:bCs w:val="false"/>
-        </w:rPr>
-        <w:t xml:space="preserve">Với nhiều doanh nghiệp nhỏ và vừa, việc vừa phải duy trì website, vừa phải tự tay đăng bài, cập nhật nội dung truyền thông mỗi ngày khiến nhân sự phụ trách luôn trong tình trạng quá tải.</w:t>
-      </w:r>
-    </w:p>
-    <w:p>
-      <w:pPr>
-        <w:spacing w:after="200"/>
-        <w:jc w:val="both"/>
-      </w:pPr>
-      <w:r>
-        <w:rPr>
-          <w:b w:val="false"/>
-          <w:bCs w:val="false"/>
-        </w:rPr>
-        <w:t xml:space="preserve">Khi doanh nghiệp phát triển thêm sản phẩm, thêm kênh, khối lượng công việc thủ công này tăng theo, nhưng nhân sự thì không thể tăng tương ứng.</w:t>
-      </w:r>
-    </w:p>
-    <w:p>
-      <w:pPr>
-        <w:spacing w:after="200"/>
-        <w:jc w:val="both"/>
-      </w:pPr>
-      <w:r>
-        <w:rPr>
-          <w:b w:val="false"/>
-          <w:bCs w:val="false"/>
-        </w:rPr>
-        <w:t xml:space="preserve">Theo số liệu công bố trên VnEconomy, tỷ lệ doanh nghiệp Việt Nam có website hiện chỉ khoảng 44%, gần như không tăng trưởng trong nhiều năm liền, phần lớn do doanh nghiệp không đủ nhân sự để duy trì cập nhật thường xuyên.</w:t>
+        <w:t xml:space="preserve">Gánh nặng vận hành truyền thông thủ công</w:t>
+      </w:r>
+    </w:p>
+    <w:p>
+      <w:pPr>
+        <w:spacing w:after="200"/>
+        <w:jc w:val="both"/>
+      </w:pPr>
+      <w:r>
+        <w:rPr>
+          <w:b w:val="false"/>
+          <w:bCs w:val="false"/>
+        </w:rPr>
+        <w:t xml:space="preserve">Với nhiều doanh nghiệp nhỏ và vừa, việc xây dựng hiện diện thương hiệu trên báo chí đòi hỏi phải tự liên hệ từng đầu báo, theo dõi lịch đăng và tổng hợp báo cáo thủ công.</w:t>
+      </w:r>
+    </w:p>
+    <w:p>
+      <w:pPr>
+        <w:spacing w:after="200"/>
+        <w:jc w:val="both"/>
+      </w:pPr>
+      <w:r>
+        <w:rPr>
+          <w:b w:val="false"/>
+          <w:bCs w:val="false"/>
+        </w:rPr>
+        <w:t xml:space="preserve">Khi doanh nghiệp muốn mở rộng phạm vi truyền thông, khối lượng công việc này tăng theo, trong khi nhân sự phụ trách vẫn không đổi.</w:t>
       </w:r>
     </w:p>
     <w:p>
@@ -136,22 +123,82 @@
         <w:pStyle w:val="Heading2"/>
       </w:pPr>
       <w:r>
-        <w:t xml:space="preserve">Giải pháp một cửa của Digicom</w:t>
-      </w:r>
-    </w:p>
-    <w:p>
-      <w:pPr>
-        <w:spacing w:after="200"/>
-        <w:jc w:val="both"/>
-      </w:pPr>
-      <w:hyperlink w:history="1" r:id="rIdzvvksejdx6un1voehh9mv">
+        <w:t xml:space="preserve">Vì sao tự làm booking báo chí khó hiệu quả</w:t>
+      </w:r>
+    </w:p>
+    <w:p>
+      <w:pPr>
+        <w:spacing w:after="200"/>
+        <w:jc w:val="both"/>
+      </w:pPr>
+      <w:r>
+        <w:rPr>
+          <w:b w:val="false"/>
+          <w:bCs w:val="false"/>
+        </w:rPr>
+        <w:t xml:space="preserve">Vấn đề không chỉ nằm ở khối lượng công việc, mà ở chỗ quan hệ với báo chí cần được xây dựng qua thời gian: mỗi lần liên hệ một đầu báo mới, doanh nghiệp gần như phải bắt đầu lại từ đầu, trong khi mỗi báo lại có quy trình duyệt bài, định dạng và lịch đăng khác nhau.</w:t>
+      </w:r>
+    </w:p>
+    <w:p>
+      <w:pPr>
+        <w:spacing w:after="200"/>
+        <w:jc w:val="both"/>
+      </w:pPr>
+      <w:r>
+        <w:rPr>
+          <w:b w:val="false"/>
+          <w:bCs w:val="false"/>
+        </w:rPr>
+        <w:t xml:space="preserve">Khi không có hệ thống theo dõi, doanh nghiệp cũng khó biết được bài đăng ở đâu mang lại hiệu quả thực sự, dẫn đến tình trạng đầu tư dàn trải hoặc bỏ cuộc giữa chừng vì không đo lường được kết quả.</w:t>
+      </w:r>
+    </w:p>
+    <w:p>
+      <w:pPr>
+        <w:spacing w:after="200"/>
+        <w:jc w:val="both"/>
+      </w:pPr>
+      <w:r>
+        <w:rPr>
+          <w:b w:val="false"/>
+          <w:bCs w:val="false"/>
+        </w:rPr>
+        <w:t xml:space="preserve">Đây là gốc rễ của bài toán chi phí: không phải chi phí đăng bài quá cao, mà chi phí vận hành và duy trì mối quan hệ báo chí một cách bài bản mới là phần doanh nghiệp nhỏ khó tự gánh.</w:t>
+      </w:r>
+    </w:p>
+    <w:p>
+      <w:pPr>
+        <w:spacing w:after="200"/>
+        <w:jc w:val="both"/>
+      </w:pPr>
+      <w:r>
+        <w:rPr>
+          <w:b w:val="false"/>
+          <w:bCs w:val="false"/>
+        </w:rPr>
+        <w:t xml:space="preserve">Theo Tổng cục Thống kê, tính đến đầu năm 2026, Việt Nam có hơn 900.000 doanh nghiệp đang hoạt động, trong đó hơn 97% là doanh nghiệp nhỏ và vừa, phần lớn không có bộ phận quan hệ báo chí riêng.</w:t>
+      </w:r>
+    </w:p>
+    <w:p>
+      <w:pPr>
+        <w:pStyle w:val="Heading2"/>
+      </w:pPr>
+      <w:r>
+        <w:t xml:space="preserve">Giải pháp booking báo chí kết hợp automation</w:t>
+      </w:r>
+    </w:p>
+    <w:p>
+      <w:pPr>
+        <w:spacing w:after="200"/>
+        <w:jc w:val="both"/>
+      </w:pPr>
+      <w:hyperlink w:history="1" r:id="rId1rzt7ieg8emtimucn0lgo">
         <w:r>
           <w:rPr>
             <w:rStyle w:val="Hyperlink"/>
             <w:b/>
             <w:bCs/>
           </w:rPr>
-          <w:t xml:space="preserve">Digicom</w:t>
+          <w:t xml:space="preserve">DigicomVN</w:t>
         </w:r>
       </w:hyperlink>
       <w:r>
@@ -159,194 +206,59 @@
           <w:b w:val="false"/>
           <w:bCs w:val="false"/>
         </w:rPr>
-        <w:t xml:space="preserve"> tập trung giải quyết đúng bài toán đó: làm website và xây dựng quy trình marketing, truyền thông tự động hoá (automation) bằng trí tuệ nhân tạo (AI), giúp doanh nghiệp tiết kiệm nhân sự, chi phí và tối ưu năng suất lao động.</w:t>
-      </w:r>
-    </w:p>
-    <w:p>
-      <w:pPr>
-        <w:spacing w:after="200"/>
-        <w:jc w:val="both"/>
-      </w:pPr>
-      <w:r>
-        <w:rPr>
-          <w:b w:val="false"/>
-          <w:bCs w:val="false"/>
-        </w:rPr>
-        <w:t xml:space="preserve">Thay vì phải có người túc trực đăng bài, theo dõi và báo cáo mỗi ngày, phần lớn công việc lặp lại được automation đảm nhiệm, con người chỉ cần giám sát và điều chỉnh chiến lược.</w:t>
-      </w:r>
-    </w:p>
-    <w:p>
-      <w:pPr>
-        <w:spacing w:after="60" w:before="120"/>
-        <w:jc w:val="center"/>
-      </w:pPr>
-      <w:r>
-        <w:drawing>
-          <wp:inline distT="0" distB="0" distL="0" distR="0">
-            <wp:extent cx="4572000" cy="3048000"/>
-            <wp:effectExtent t="0" r="0" b="0" l="0"/>
-            <wp:docPr id="1" name="Anh minh hoa" descr="Ảnh minh họa: Automation giúp doanh nghiệp tính toán, tiết kiệm chi phí nhân sự cho các đầu việc lặp lại." title="Anh minh hoa"/>
-            <wp:cNvGraphicFramePr>
-              <a:graphicFrameLocks xmlns:a="http://schemas.openxmlformats.org/drawingml/2006/main" noChangeAspect="1"/>
-            </wp:cNvGraphicFramePr>
-            <a:graphic xmlns:a="http://schemas.openxmlformats.org/drawingml/2006/main">
-              <a:graphicData uri="http://schemas.openxmlformats.org/drawingml/2006/picture">
-                <pic:pic xmlns:pic="http://schemas.openxmlformats.org/drawingml/2006/picture">
-                  <pic:nvPicPr>
-                    <pic:cNvPr id="0" name="" descr=""/>
-                    <pic:cNvPicPr>
-                      <a:picLocks noChangeAspect="1" noChangeArrowheads="1"/>
-                    </pic:cNvPicPr>
-                  </pic:nvPicPr>
-                  <pic:blipFill>
-                    <a:blip r:embed="rId8" cstate="none"/>
-                    <a:srcRect/>
-                    <a:stretch>
-                      <a:fillRect/>
-                    </a:stretch>
-                  </pic:blipFill>
-                  <pic:spPr bwMode="auto">
-                    <a:xfrm>
-                      <a:off x="0" y="0"/>
-                      <a:ext cx="4572000" cy="3048000"/>
-                    </a:xfrm>
-                    <a:prstGeom prst="rect">
-                      <a:avLst/>
-                    </a:prstGeom>
-                  </pic:spPr>
-                </pic:pic>
-              </a:graphicData>
-            </a:graphic>
-          </wp:inline>
-        </w:drawing>
-      </w:r>
-    </w:p>
-    <w:p>
-      <w:pPr>
-        <w:spacing w:after="200"/>
-        <w:jc w:val="center"/>
-      </w:pPr>
-      <w:r>
-        <w:rPr>
-          <w:i/>
-          <w:iCs/>
-          <w:sz w:val="20"/>
-          <w:szCs w:val="20"/>
-        </w:rPr>
-        <w:t xml:space="preserve">Ảnh minh họa: Automation giúp doanh nghiệp tính toán, tiết kiệm chi phí nhân sự cho các đầu việc lặp lại.</w:t>
-      </w:r>
-    </w:p>
-    <w:p>
-      <w:pPr>
-        <w:spacing w:after="200"/>
-        <w:jc w:val="both"/>
-      </w:pPr>
-      <w:r>
-        <w:rPr>
-          <w:b w:val="false"/>
-          <w:bCs w:val="false"/>
-        </w:rPr>
-        <w:t xml:space="preserve">Ông Đỗ Xuân Hiếu, Giám đốc Digicom (CÔNG TY TNHH DỊCH VỤ TRUYỀN THÔNG DIGITO COMBAT), người có gần 15 năm kinh nghiệm trong lĩnh vực truyền thông và marketing, cho biết mô hình website kết hợp automation không chỉ giúp doanh nghiệp tiết kiệm chi phí nhân sự mà còn đảm bảo nội dung được cập nhật đều đặn, không bị gián đoạn khi nhân sự nghỉ việc hay thay đổi.</w:t>
-      </w:r>
-    </w:p>
-    <w:p>
-      <w:pPr>
-        <w:spacing w:after="200"/>
-        <w:jc w:val="both"/>
-      </w:pPr>
-      <w:r>
-        <w:rPr>
-          <w:b w:val="false"/>
-          <w:bCs w:val="false"/>
-        </w:rPr>
-        <w:t xml:space="preserve">Theo ước tính của McKinsey, việc tự động hoá các quy trình thủ công bằng AI có thể giúp doanh nghiệp tiết kiệm trung bình 30 đến 40% chi phí vận hành, một mức tiết kiệm đủ lớn để doanh nghiệp cân nhắc đầu tư vào automation thay vì tuyển thêm nhân sự.</w:t>
-      </w:r>
-    </w:p>
-    <w:p>
-      <w:pPr>
-        <w:spacing w:after="200"/>
-        <w:jc w:val="both"/>
-      </w:pPr>
-      <w:r>
-        <w:rPr>
-          <w:b w:val="false"/>
-          <w:bCs w:val="false"/>
-        </w:rPr>
-        <w:t xml:space="preserve">Theo ông Hiếu, rủi ro phổ biến nhất mà doanh nghiệp gặp phải khi không có automation là website bị bỏ quên, nội dung không được cập nhật trong thời gian dài vì nhân sự phụ trách bận việc khác.</w:t>
-      </w:r>
-    </w:p>
-    <w:p>
-      <w:pPr>
-        <w:spacing w:after="200"/>
-        <w:jc w:val="both"/>
-      </w:pPr>
-      <w:r>
-        <w:rPr>
-          <w:b w:val="false"/>
-          <w:bCs w:val="false"/>
-        </w:rPr>
-        <w:t xml:space="preserve">Hệ thống automation của Digicom giúp duy trì lịch đăng bài, theo dõi hiệu quả và cảnh báo sớm khi có vấn đề kỹ thuật, giảm phụ thuộc vào một cá nhân cụ thể.</w:t>
-      </w:r>
-    </w:p>
-    <w:p>
-      <w:pPr>
-        <w:spacing w:after="60" w:before="120"/>
-        <w:jc w:val="center"/>
-      </w:pPr>
-      <w:r>
-        <w:drawing>
-          <wp:inline distT="0" distB="0" distL="0" distR="0">
-            <wp:extent cx="4572000" cy="3048000"/>
-            <wp:effectExtent t="0" r="0" b="0" l="0"/>
-            <wp:docPr id="1" name="Anh minh hoa" descr="Ảnh minh họa: Hệ thống automation tự động theo dõi và báo cáo hiệu quả truyền thông." title="Anh minh hoa"/>
-            <wp:cNvGraphicFramePr>
-              <a:graphicFrameLocks xmlns:a="http://schemas.openxmlformats.org/drawingml/2006/main" noChangeAspect="1"/>
-            </wp:cNvGraphicFramePr>
-            <a:graphic xmlns:a="http://schemas.openxmlformats.org/drawingml/2006/main">
-              <a:graphicData uri="http://schemas.openxmlformats.org/drawingml/2006/picture">
-                <pic:pic xmlns:pic="http://schemas.openxmlformats.org/drawingml/2006/picture">
-                  <pic:nvPicPr>
-                    <pic:cNvPr id="0" name="" descr=""/>
-                    <pic:cNvPicPr>
-                      <a:picLocks noChangeAspect="1" noChangeArrowheads="1"/>
-                    </pic:cNvPicPr>
-                  </pic:nvPicPr>
-                  <pic:blipFill>
-                    <a:blip r:embed="rId9" cstate="none"/>
-                    <a:srcRect/>
-                    <a:stretch>
-                      <a:fillRect/>
-                    </a:stretch>
-                  </pic:blipFill>
-                  <pic:spPr bwMode="auto">
-                    <a:xfrm>
-                      <a:off x="0" y="0"/>
-                      <a:ext cx="4572000" cy="3048000"/>
-                    </a:xfrm>
-                    <a:prstGeom prst="rect">
-                      <a:avLst/>
-                    </a:prstGeom>
-                  </pic:spPr>
-                </pic:pic>
-              </a:graphicData>
-            </a:graphic>
-          </wp:inline>
-        </w:drawing>
-      </w:r>
-    </w:p>
-    <w:p>
-      <w:pPr>
-        <w:spacing w:after="200"/>
-        <w:jc w:val="center"/>
-      </w:pPr>
-      <w:r>
-        <w:rPr>
-          <w:i/>
-          <w:iCs/>
-          <w:sz w:val="20"/>
-          <w:szCs w:val="20"/>
-        </w:rPr>
-        <w:t xml:space="preserve">Ảnh minh họa: Hệ thống automation tự động theo dõi và báo cáo hiệu quả truyền thông.</w:t>
+        <w:t xml:space="preserve"> tập trung giải quyết đúng bài toán đó: cung cấp dịch vụ truyền thông, trọng tâm là booking báo chí và PR, kết hợp automation ứng dụng AI để giảm bớt phần việc thủ công.</w:t>
+      </w:r>
+    </w:p>
+    <w:p>
+      <w:pPr>
+        <w:spacing w:after="200"/>
+        <w:jc w:val="both"/>
+      </w:pPr>
+      <w:r>
+        <w:rPr>
+          <w:b w:val="false"/>
+          <w:bCs w:val="false"/>
+        </w:rPr>
+        <w:t xml:space="preserve">Thay vì phải có người túc trực liên hệ báo chí và theo dõi tiến độ mỗi ngày, phần lớn công việc lặp lại được hệ thống hỗ trợ tự động.</w:t>
+      </w:r>
+    </w:p>
+    <w:p>
+      <w:pPr>
+        <w:spacing w:after="200"/>
+        <w:jc w:val="both"/>
+      </w:pPr>
+      <w:r>
+        <w:rPr>
+          <w:b w:val="false"/>
+          <w:bCs w:val="false"/>
+        </w:rPr>
+        <w:t xml:space="preserve">Ông Đỗ Xuân Hiếu, Giám đốc DigicomVN (CÔNG TY TNHH DỊCH VỤ TRUYỀN THÔNG DIGITO COMBAT), người có gần 15 năm kinh nghiệm trong lĩnh vực truyền thông và marketing, cho biết rủi ro phổ biến nhất mà doanh nghiệp gặp phải khi không có kế hoạch booking báo chí bài bản là thương hiệu gần như vắng bóng trên báo chí, khiến khách hàng lẫn công cụ tìm kiếm khó nhận diện.</w:t>
+      </w:r>
+    </w:p>
+    <w:p>
+      <w:pPr>
+        <w:spacing w:after="200"/>
+        <w:jc w:val="both"/>
+      </w:pPr>
+      <w:r>
+        <w:rPr>
+          <w:b w:val="false"/>
+          <w:bCs w:val="false"/>
+        </w:rPr>
+        <w:t xml:space="preserve">Theo ước tính của McKinsey, việc tự động hoá các quy trình thủ công bằng AI có thể giúp doanh nghiệp tiết kiệm trung bình 30 đến 40% chi phí vận hành.</w:t>
+      </w:r>
+    </w:p>
+    <w:p>
+      <w:pPr>
+        <w:spacing w:after="200"/>
+        <w:jc w:val="both"/>
+      </w:pPr>
+      <w:r>
+        <w:rPr>
+          <w:b w:val="false"/>
+          <w:bCs w:val="false"/>
+        </w:rPr>
+        <w:t xml:space="preserve">Hệ thống automation của DigicomVN giúp duy trì lịch booking báo, theo dõi tiến độ đăng bài và tổng hợp báo cáo hiệu quả mà không cần nhân sự xử lý thủ công từng bước.</w:t>
       </w:r>
     </w:p>
     <w:p>
@@ -369,7 +281,7 @@
         </w:rPr>
         <w:t xml:space="preserve">Một doanh nghiệp đã áp dụng mô hình này là </w:t>
       </w:r>
-      <w:hyperlink w:history="1" r:id="rIdpce-l8yawlofmb0knuohf">
+      <w:hyperlink w:history="1" r:id="rIdueazzdunlevxevhfhoua3">
         <w:r>
           <w:rPr>
             <w:rStyle w:val="Hyperlink"/>
@@ -384,107 +296,46 @@
           <w:b w:val="false"/>
           <w:bCs w:val="false"/>
         </w:rPr>
-        <w:t xml:space="preserve">, hoạt động trong lĩnh vực vật tư đóng gói công nghiệp. ICD Việt Nam hiện sử dụng website và quy trình marketing, truyền thông automation do Digicom xây dựng.</w:t>
-      </w:r>
-    </w:p>
-    <w:p>
-      <w:pPr>
-        <w:spacing w:after="200"/>
-        <w:jc w:val="both"/>
-      </w:pPr>
-      <w:r>
-        <w:rPr>
-          <w:b w:val="false"/>
-          <w:bCs w:val="false"/>
-        </w:rPr>
-        <w:t xml:space="preserve">Ông Lê Văn Thăng, Giám đốc ICD Việt Nam, cho biết việc automation hoá giúp doanh nghiệp giảm đáng kể khối lượng công việc thủ công, đồng thời có được kết quả truyền thông ổn định hơn so với trước.</w:t>
-      </w:r>
-    </w:p>
-    <w:p>
-      <w:pPr>
-        <w:spacing w:after="200"/>
-        <w:jc w:val="both"/>
-      </w:pPr>
-      <w:r>
-        <w:rPr>
-          <w:b w:val="false"/>
-          <w:bCs w:val="false"/>
-        </w:rPr>
-        <w:t xml:space="preserve">Ông Thăng nói thêm, trước đây ICD Việt Nam phải phân công nhân sự kiêm nhiệm việc cập nhật website và đăng bài truyền thông, dẫn đến công việc thường bị trễ hoặc bỏ sót.</w:t>
-      </w:r>
-    </w:p>
-    <w:p>
-      <w:pPr>
-        <w:spacing w:after="200"/>
-        <w:jc w:val="both"/>
-      </w:pPr>
-      <w:r>
-        <w:rPr>
-          <w:b w:val="false"/>
-          <w:bCs w:val="false"/>
-        </w:rPr>
-        <w:t xml:space="preserve">Từ khi chuyển sang dùng website và automation của Digicom, mọi việc được xử lý tự động theo lịch, giúp nhân sự tập trung vào công việc kinh doanh cốt lõi thay vì việc hành chính lặp lại.</w:t>
-      </w:r>
-    </w:p>
-    <w:p>
-      <w:pPr>
-        <w:spacing w:after="60" w:before="120"/>
-        <w:jc w:val="center"/>
-      </w:pPr>
-      <w:r>
-        <w:drawing>
-          <wp:inline distT="0" distB="0" distL="0" distR="0">
-            <wp:extent cx="4572000" cy="3048000"/>
-            <wp:effectExtent t="0" r="0" b="0" l="0"/>
-            <wp:docPr id="1" name="Anh minh hoa" descr="Ảnh minh họa: Hỗ trợ khách hàng là một phần trong quy trình truyền thông được tự động hoá." title="Anh minh hoa"/>
-            <wp:cNvGraphicFramePr>
-              <a:graphicFrameLocks xmlns:a="http://schemas.openxmlformats.org/drawingml/2006/main" noChangeAspect="1"/>
-            </wp:cNvGraphicFramePr>
-            <a:graphic xmlns:a="http://schemas.openxmlformats.org/drawingml/2006/main">
-              <a:graphicData uri="http://schemas.openxmlformats.org/drawingml/2006/picture">
-                <pic:pic xmlns:pic="http://schemas.openxmlformats.org/drawingml/2006/picture">
-                  <pic:nvPicPr>
-                    <pic:cNvPr id="0" name="" descr=""/>
-                    <pic:cNvPicPr>
-                      <a:picLocks noChangeAspect="1" noChangeArrowheads="1"/>
-                    </pic:cNvPicPr>
-                  </pic:nvPicPr>
-                  <pic:blipFill>
-                    <a:blip r:embed="rId10" cstate="none"/>
-                    <a:srcRect/>
-                    <a:stretch>
-                      <a:fillRect/>
-                    </a:stretch>
-                  </pic:blipFill>
-                  <pic:spPr bwMode="auto">
-                    <a:xfrm>
-                      <a:off x="0" y="0"/>
-                      <a:ext cx="4572000" cy="3048000"/>
-                    </a:xfrm>
-                    <a:prstGeom prst="rect">
-                      <a:avLst/>
-                    </a:prstGeom>
-                  </pic:spPr>
-                </pic:pic>
-              </a:graphicData>
-            </a:graphic>
-          </wp:inline>
-        </w:drawing>
-      </w:r>
-    </w:p>
-    <w:p>
-      <w:pPr>
-        <w:spacing w:after="200"/>
-        <w:jc w:val="center"/>
-      </w:pPr>
-      <w:r>
-        <w:rPr>
-          <w:i/>
-          <w:iCs/>
-          <w:sz w:val="20"/>
-          <w:szCs w:val="20"/>
-        </w:rPr>
-        <w:t xml:space="preserve">Ảnh minh họa: Hỗ trợ khách hàng là một phần trong quy trình truyền thông được tự động hoá.</w:t>
+        <w:t xml:space="preserve">, hoạt động trong lĩnh vực vật tư đóng gói công nghiệp.</w:t>
+      </w:r>
+    </w:p>
+    <w:p>
+      <w:pPr>
+        <w:spacing w:after="200"/>
+        <w:jc w:val="both"/>
+      </w:pPr>
+      <w:r>
+        <w:rPr>
+          <w:b w:val="false"/>
+          <w:bCs w:val="false"/>
+        </w:rPr>
+        <w:t xml:space="preserve">Ông Lê Văn Thăng, Giám đốc ICD Việt Nam, cho biết việc booking báo chí đều đặn giúp thương hiệu ICD Việt Nam xuất hiện thường xuyên hơn trên các kênh báo chí uy tín.</w:t>
+      </w:r>
+    </w:p>
+    <w:p>
+      <w:pPr>
+        <w:spacing w:after="200"/>
+        <w:jc w:val="both"/>
+      </w:pPr>
+      <w:r>
+        <w:rPr>
+          <w:b w:val="false"/>
+          <w:bCs w:val="false"/>
+        </w:rPr>
+        <w:t xml:space="preserve">Ông Thăng nói thêm, trước đây ICD Việt Nam phải phân công nhân sự kiêm nhiệm việc liên hệ báo chí, dẫn đến tần suất đăng bài không đều.</w:t>
+      </w:r>
+    </w:p>
+    <w:p>
+      <w:pPr>
+        <w:spacing w:after="200"/>
+        <w:jc w:val="both"/>
+      </w:pPr>
+      <w:r>
+        <w:rPr>
+          <w:b w:val="false"/>
+          <w:bCs w:val="false"/>
+        </w:rPr>
+        <w:t xml:space="preserve">Từ khi sử dụng dịch vụ của DigicomVN, việc booking báo được lên lịch và theo dõi tự động, giúp thương hiệu duy trì hiện diện ổn định hơn.</w:t>
       </w:r>
     </w:p>
     <w:p>
@@ -505,94 +356,20 @@
           <w:b w:val="false"/>
           <w:bCs w:val="false"/>
         </w:rPr>
-        <w:t xml:space="preserve">Với các doanh nghiệp ở khu vực trung du và miền núi phía Bắc như Tuyên Quang, nơi mặt bằng chi phí thuê nhân sự chuyên trách truyền thông, marketing còn hạn chế, mô hình website kết hợp automation lại càng có ý nghĩa thực tế.</w:t>
-      </w:r>
-    </w:p>
-    <w:p>
-      <w:pPr>
-        <w:spacing w:after="200"/>
-        <w:jc w:val="both"/>
-      </w:pPr>
-      <w:r>
-        <w:rPr>
-          <w:b w:val="false"/>
-          <w:bCs w:val="false"/>
-        </w:rPr>
-        <w:t xml:space="preserve">Thay vì tuyển thêm người cho từng đầu việc nhỏ, doanh nghiệp có thể để automation đảm nhiệm phần việc lặp lại, tập trung nguồn lực cho hoạt động sản xuất kinh doanh cốt lõi.</w:t>
-      </w:r>
-    </w:p>
-    <w:p>
-      <w:pPr>
-        <w:spacing w:after="200"/>
-        <w:jc w:val="both"/>
-      </w:pPr>
-      <w:r>
-        <w:rPr>
-          <w:b w:val="false"/>
-          <w:bCs w:val="false"/>
-        </w:rPr>
-        <w:t xml:space="preserve">Đại diện Digicom cho biết thêm, với những doanh nghiệp muốn từng bước tự chủ, đội ngũ luôn hướng dẫn cách vận hành quy trình automation ngay trong quá trình triển khai, giúp nhân sự nội bộ dần làm quen với việc dùng AI vào công việc hằng ngày thay vì phụ thuộc hoàn toàn vào bên cung cấp dịch vụ.</w:t>
-      </w:r>
-    </w:p>
-    <w:p>
-      <w:pPr>
-        <w:spacing w:after="60" w:before="120"/>
-        <w:jc w:val="center"/>
-      </w:pPr>
-      <w:r>
-        <w:drawing>
-          <wp:inline distT="0" distB="0" distL="0" distR="0">
-            <wp:extent cx="4572000" cy="3048000"/>
-            <wp:effectExtent t="0" r="0" b="0" l="0"/>
-            <wp:docPr id="1" name="Anh minh hoa" descr="Ảnh minh họa: AI là nền tảng cho các quy trình automation website và truyền thông hiện nay." title="Anh minh hoa"/>
-            <wp:cNvGraphicFramePr>
-              <a:graphicFrameLocks xmlns:a="http://schemas.openxmlformats.org/drawingml/2006/main" noChangeAspect="1"/>
-            </wp:cNvGraphicFramePr>
-            <a:graphic xmlns:a="http://schemas.openxmlformats.org/drawingml/2006/main">
-              <a:graphicData uri="http://schemas.openxmlformats.org/drawingml/2006/picture">
-                <pic:pic xmlns:pic="http://schemas.openxmlformats.org/drawingml/2006/picture">
-                  <pic:nvPicPr>
-                    <pic:cNvPr id="0" name="" descr=""/>
-                    <pic:cNvPicPr>
-                      <a:picLocks noChangeAspect="1" noChangeArrowheads="1"/>
-                    </pic:cNvPicPr>
-                  </pic:nvPicPr>
-                  <pic:blipFill>
-                    <a:blip r:embed="rId11" cstate="none"/>
-                    <a:srcRect/>
-                    <a:stretch>
-                      <a:fillRect/>
-                    </a:stretch>
-                  </pic:blipFill>
-                  <pic:spPr bwMode="auto">
-                    <a:xfrm>
-                      <a:off x="0" y="0"/>
-                      <a:ext cx="4572000" cy="3048000"/>
-                    </a:xfrm>
-                    <a:prstGeom prst="rect">
-                      <a:avLst/>
-                    </a:prstGeom>
-                  </pic:spPr>
-                </pic:pic>
-              </a:graphicData>
-            </a:graphic>
-          </wp:inline>
-        </w:drawing>
-      </w:r>
-    </w:p>
-    <w:p>
-      <w:pPr>
-        <w:spacing w:after="200"/>
-        <w:jc w:val="center"/>
-      </w:pPr>
-      <w:r>
-        <w:rPr>
-          <w:i/>
-          <w:iCs/>
-          <w:sz w:val="20"/>
-          <w:szCs w:val="20"/>
-        </w:rPr>
-        <w:t xml:space="preserve">Ảnh minh họa: AI là nền tảng cho các quy trình automation website và truyền thông hiện nay.</w:t>
+        <w:t xml:space="preserve">Với các doanh nghiệp ở khu vực trung du và miền núi phía Bắc như Tuyên Quang, nơi mặt bằng chi phí thấp hơn nhưng cũng khó tiếp cận đội ngũ truyền thông chuyên nghiệp, việc có một dịch vụ booking báo chí kèm automation giúp tiết kiệm đáng kể chi phí so với việc tự xây dựng đội ngũ quan hệ báo chí riêng.</w:t>
+      </w:r>
+    </w:p>
+    <w:p>
+      <w:pPr>
+        <w:spacing w:after="200"/>
+        <w:jc w:val="both"/>
+      </w:pPr>
+      <w:r>
+        <w:rPr>
+          <w:b w:val="false"/>
+          <w:bCs w:val="false"/>
+        </w:rPr>
+        <w:t xml:space="preserve">Đại diện DigicomVN cho biết thêm, với những doanh nghiệp muốn từng bước tự chủ truyền thông, đội ngũ luôn hướng dẫn cách theo dõi hiệu quả từng đợt booking báo, thay vì chỉ giao khoán hoàn toàn.</w:t>
       </w:r>
     </w:p>
     <w:p>
@@ -613,7 +390,7 @@
           <w:b w:val="false"/>
           <w:bCs w:val="false"/>
         </w:rPr>
-        <w:t xml:space="preserve">Trong bối cảnh chi phí nhân sự ngày càng là gánh nặng với doanh nghiệp nhỏ và vừa, mô hình website kết hợp automation truyền thông ứng dụng AI như của Digicom được xem là hướng đi phù hợp với xu thế chung.</w:t>
+        <w:t xml:space="preserve">Trong bối cảnh chi phí nhân sự ngày càng là gánh nặng với doanh nghiệp nhỏ và vừa, mô hình dịch vụ truyền thông kết hợp automation mà DigicomVN theo đuổi đang dần trở thành lựa chọn được nhiều doanh nghiệp cân nhắc.</w:t>
       </w:r>
     </w:p>
     <w:p>

</xml_diff>